<commit_message>
nmv 10 04 2026
</commit_message>
<xml_diff>
--- a/TS Jatai Ghanam Project/TS 1.8/TS 1.8 Ghanam Sanskrit Corrections.docx
+++ b/TS Jatai Ghanam Project/TS 1.8/TS 1.8 Ghanam Sanskrit Corrections.docx
@@ -148,7 +148,7 @@
       </w:tr>
       <w:tr>
         <w:trPr>
-          <w:trHeight w:val="1338"/>
+          <w:trHeight w:val="4585"/>
         </w:trPr>
         <w:tc>
           <w:tcPr>
@@ -919,115 +919,100 @@
               <w:adjustRightInd w:val="0"/>
               <w:spacing w:line="240" w:lineRule="auto"/>
               <w:rPr>
-                <w:rFonts w:ascii="BRH Devanagari Extra" w:hAnsi="BRH Devanagari Extra" w:cs="BRH Devanagari Extra"/>
-                <w:color w:val="000000"/>
-                <w:sz w:val="32"/>
-                <w:szCs w:val="40"/>
-              </w:rPr>
-            </w:pPr>
-            <w:r>
-              <w:rPr>
-                <w:rFonts w:ascii="BRH Devanagari Extra" w:hAnsi="BRH Devanagari Extra" w:cs="BRH Devanagari Extra"/>
-                <w:color w:val="000000"/>
-                <w:sz w:val="32"/>
-                <w:szCs w:val="40"/>
-              </w:rPr>
-              <w:t>ÌuÉ</w:t>
-            </w:r>
-            <w:r>
-              <w:rPr>
-                <w:rFonts w:ascii="BRH Devanagari Extra" w:hAnsi="BRH Devanagari Extra" w:cs="BRH Devanagari Extra"/>
-                <w:color w:val="000000"/>
-                <w:sz w:val="32"/>
-                <w:szCs w:val="40"/>
-                <w:highlight w:val="yellow"/>
-              </w:rPr>
-              <w:t>µÉÉ</w:t>
-            </w:r>
-            <w:r>
-              <w:rPr>
-                <w:rFonts w:ascii="BRH Devanagari Extra" w:hAnsi="BRH Devanagari Extra" w:cs="BRH Devanagari Extra"/>
-                <w:color w:val="000000"/>
-                <w:sz w:val="32"/>
-                <w:szCs w:val="40"/>
-              </w:rPr>
-              <w:t xml:space="preserve">þ </w:t>
-            </w:r>
-            <w:r>
-              <w:rPr>
-                <w:rFonts w:ascii="BRH Devanagari Extra" w:hAnsi="BRH Devanagari Extra" w:cs="BRH Devanagari Extra"/>
-                <w:color w:val="000000"/>
-                <w:sz w:val="32"/>
-                <w:szCs w:val="40"/>
-                <w:highlight w:val="yellow"/>
-              </w:rPr>
-              <w:t>A</w:t>
-            </w:r>
-            <w:r>
-              <w:rPr>
-                <w:rFonts w:ascii="BRH Malayalam Extra" w:hAnsi="BRH Malayalam Extra" w:cs="BRH Devanagari Extra"/>
-                <w:color w:val="000000"/>
-                <w:szCs w:val="40"/>
-              </w:rPr>
-              <w:t>–</w:t>
-            </w:r>
-            <w:r>
-              <w:rPr>
-                <w:rFonts w:ascii="BRH Devanagari Extra" w:hAnsi="BRH Devanagari Extra" w:cs="BRH Devanagari Extra"/>
-                <w:color w:val="000000"/>
-                <w:sz w:val="32"/>
-                <w:szCs w:val="40"/>
-              </w:rPr>
-              <w:t>xqÉå A</w:t>
-            </w:r>
-            <w:r>
-              <w:rPr>
-                <w:rFonts w:ascii="BRH Malayalam Extra" w:hAnsi="BRH Malayalam Extra" w:cs="BRH Devanagari Extra"/>
-                <w:color w:val="000000"/>
-                <w:szCs w:val="40"/>
-              </w:rPr>
-              <w:t>–</w:t>
-            </w:r>
-            <w:r>
-              <w:rPr>
-                <w:rFonts w:ascii="BRH Devanagari Extra" w:hAnsi="BRH Devanagari Extra" w:cs="BRH Devanagari Extra"/>
-                <w:color w:val="000000"/>
-                <w:sz w:val="32"/>
-                <w:szCs w:val="40"/>
-              </w:rPr>
-              <w:t>xqÉå ÌuÉµÉÉþ iÉ</w:t>
-            </w:r>
-            <w:r>
-              <w:rPr>
-                <w:rFonts w:ascii="BRH Malayalam Extra" w:hAnsi="BRH Malayalam Extra" w:cs="BRH Devanagari Extra"/>
-                <w:color w:val="000000"/>
-                <w:szCs w:val="40"/>
-              </w:rPr>
-              <w:t>–</w:t>
-            </w:r>
-            <w:r>
-              <w:rPr>
-                <w:rFonts w:ascii="BRH Devanagari Extra" w:hAnsi="BRH Devanagari Extra" w:cs="BRH Devanagari Extra"/>
-                <w:color w:val="000000"/>
-                <w:sz w:val="32"/>
-                <w:szCs w:val="40"/>
-              </w:rPr>
-              <w:t xml:space="preserve">lÉÔwÉÑþ | </w:t>
-            </w:r>
-          </w:p>
-          <w:p>
-            <w:pPr>
-              <w:widowControl w:val="0"/>
-              <w:autoSpaceDE w:val="0"/>
-              <w:autoSpaceDN w:val="0"/>
-              <w:adjustRightInd w:val="0"/>
-              <w:spacing w:line="240" w:lineRule="auto"/>
-              <w:rPr>
                 <w:rFonts w:cs="BRH Malayalam Extra"/>
                 <w:color w:val="000000"/>
                 <w:szCs w:val="40"/>
               </w:rPr>
             </w:pPr>
+            <w:r>
+              <w:rPr>
+                <w:rFonts w:ascii="BRH Devanagari Extra" w:hAnsi="BRH Devanagari Extra" w:cs="BRH Devanagari Extra"/>
+                <w:color w:val="000000"/>
+                <w:sz w:val="32"/>
+                <w:szCs w:val="40"/>
+              </w:rPr>
+              <w:t>ÌuÉ</w:t>
+            </w:r>
+            <w:r>
+              <w:rPr>
+                <w:rFonts w:ascii="BRH Devanagari Extra" w:hAnsi="BRH Devanagari Extra" w:cs="BRH Devanagari Extra"/>
+                <w:color w:val="000000"/>
+                <w:sz w:val="32"/>
+                <w:szCs w:val="40"/>
+                <w:highlight w:val="yellow"/>
+              </w:rPr>
+              <w:t>µÉÉ</w:t>
+            </w:r>
+            <w:r>
+              <w:rPr>
+                <w:rFonts w:ascii="BRH Devanagari Extra" w:hAnsi="BRH Devanagari Extra" w:cs="BRH Devanagari Extra"/>
+                <w:color w:val="000000"/>
+                <w:sz w:val="32"/>
+                <w:szCs w:val="40"/>
+              </w:rPr>
+              <w:t xml:space="preserve">þ </w:t>
+            </w:r>
+            <w:r>
+              <w:rPr>
+                <w:rFonts w:ascii="BRH Devanagari Extra" w:hAnsi="BRH Devanagari Extra" w:cs="BRH Devanagari Extra"/>
+                <w:color w:val="000000"/>
+                <w:sz w:val="32"/>
+                <w:szCs w:val="40"/>
+                <w:highlight w:val="yellow"/>
+              </w:rPr>
+              <w:t>A</w:t>
+            </w:r>
+            <w:r>
+              <w:rPr>
+                <w:rFonts w:ascii="BRH Malayalam Extra" w:hAnsi="BRH Malayalam Extra" w:cs="BRH Devanagari Extra"/>
+                <w:color w:val="000000"/>
+                <w:szCs w:val="40"/>
+              </w:rPr>
+              <w:t>–</w:t>
+            </w:r>
+            <w:r>
+              <w:rPr>
+                <w:rFonts w:ascii="BRH Devanagari Extra" w:hAnsi="BRH Devanagari Extra" w:cs="BRH Devanagari Extra"/>
+                <w:color w:val="000000"/>
+                <w:sz w:val="32"/>
+                <w:szCs w:val="40"/>
+              </w:rPr>
+              <w:t>xqÉå A</w:t>
+            </w:r>
+            <w:r>
+              <w:rPr>
+                <w:rFonts w:ascii="BRH Malayalam Extra" w:hAnsi="BRH Malayalam Extra" w:cs="BRH Devanagari Extra"/>
+                <w:color w:val="000000"/>
+                <w:szCs w:val="40"/>
+              </w:rPr>
+              <w:t>–</w:t>
+            </w:r>
+            <w:r>
+              <w:rPr>
+                <w:rFonts w:ascii="BRH Devanagari Extra" w:hAnsi="BRH Devanagari Extra" w:cs="BRH Devanagari Extra"/>
+                <w:color w:val="000000"/>
+                <w:sz w:val="32"/>
+                <w:szCs w:val="40"/>
+              </w:rPr>
+              <w:t>xqÉå ÌuÉµÉÉþ iÉ</w:t>
+            </w:r>
+            <w:r>
+              <w:rPr>
+                <w:rFonts w:ascii="BRH Malayalam Extra" w:hAnsi="BRH Malayalam Extra" w:cs="BRH Devanagari Extra"/>
+                <w:color w:val="000000"/>
+                <w:szCs w:val="40"/>
+              </w:rPr>
+              <w:t>–</w:t>
+            </w:r>
+            <w:r>
+              <w:rPr>
+                <w:rFonts w:ascii="BRH Devanagari Extra" w:hAnsi="BRH Devanagari Extra" w:cs="BRH Devanagari Extra"/>
+                <w:color w:val="000000"/>
+                <w:sz w:val="32"/>
+                <w:szCs w:val="40"/>
+              </w:rPr>
+              <w:t xml:space="preserve">lÉÔwÉÑþ | </w:t>
+            </w:r>
           </w:p>
         </w:tc>
         <w:tc>
@@ -1782,9 +1767,8 @@
               <w:adjustRightInd w:val="0"/>
               <w:spacing w:line="240" w:lineRule="auto"/>
               <w:rPr>
-                <w:rFonts w:ascii="BRH Devanagari Extra" w:hAnsi="BRH Devanagari Extra" w:cs="BRH Devanagari Extra"/>
+                <w:rFonts w:cs="BRH Malayalam Extra"/>
                 <w:color w:val="000000"/>
-                <w:sz w:val="32"/>
                 <w:szCs w:val="40"/>
               </w:rPr>
             </w:pPr>
@@ -1869,20 +1853,6 @@
               </w:rPr>
               <w:t xml:space="preserve">lÉÔwÉÑþ | </w:t>
             </w:r>
-          </w:p>
-          <w:p>
-            <w:pPr>
-              <w:widowControl w:val="0"/>
-              <w:autoSpaceDE w:val="0"/>
-              <w:autoSpaceDN w:val="0"/>
-              <w:adjustRightInd w:val="0"/>
-              <w:spacing w:line="240" w:lineRule="auto"/>
-              <w:rPr>
-                <w:rFonts w:cs="BRH Malayalam Extra"/>
-                <w:color w:val="000000"/>
-                <w:szCs w:val="40"/>
-              </w:rPr>
-            </w:pPr>
           </w:p>
         </w:tc>
       </w:tr>
@@ -2045,28 +2015,36 @@
               <w:adjustRightInd w:val="0"/>
               <w:spacing w:line="240" w:lineRule="auto"/>
               <w:rPr>
+                <w:rFonts w:cs="BRH Malayalam Extra"/>
+                <w:szCs w:val="40"/>
+              </w:rPr>
+            </w:pPr>
+            <w:r>
+              <w:rPr>
                 <w:rFonts w:ascii="BRH Devanagari Extra" w:hAnsi="BRH Devanagari Extra" w:cs="BRH Devanagari Extra"/>
                 <w:color w:val="000000"/>
                 <w:sz w:val="32"/>
                 <w:szCs w:val="40"/>
               </w:rPr>
-            </w:pPr>
-            <w:r>
-              <w:rPr>
-                <w:rFonts w:ascii="BRH Devanagari Extra" w:hAnsi="BRH Devanagari Extra" w:cs="BRH Devanagari Extra"/>
+              <w:t>E</w:t>
+            </w:r>
+            <w:r>
+              <w:rPr>
+                <w:rFonts w:ascii="BRH Malayalam Extra" w:hAnsi="BRH Malayalam Extra" w:cs="BRH Devanagari Extra"/>
                 <w:color w:val="000000"/>
-                <w:sz w:val="32"/>
-                <w:szCs w:val="40"/>
-              </w:rPr>
-              <w:t>E</w:t>
-            </w:r>
-            <w:r>
-              <w:rPr>
-                <w:rFonts w:ascii="BRH Malayalam Extra" w:hAnsi="BRH Malayalam Extra" w:cs="BRH Devanagari Extra"/>
+                <w:szCs w:val="40"/>
+              </w:rPr>
+              <w:t>–</w:t>
+            </w:r>
+            <w:r>
+              <w:rPr>
+                <w:rFonts w:ascii="BRH Devanagari Extra" w:hAnsi="BRH Devanagari Extra" w:cs="BRH Devanagari Extra"/>
                 <w:color w:val="000000"/>
-                <w:szCs w:val="40"/>
-              </w:rPr>
-              <w:t>–</w:t>
+                <w:sz w:val="32"/>
+                <w:szCs w:val="40"/>
+                <w:highlight w:val="yellow"/>
+              </w:rPr>
+              <w:t>ÍxÉ</w:t>
             </w:r>
             <w:r>
               <w:rPr>
@@ -2074,83 +2052,60 @@
                 <w:color w:val="000000"/>
                 <w:sz w:val="32"/>
                 <w:szCs w:val="40"/>
-                <w:highlight w:val="yellow"/>
-              </w:rPr>
-              <w:t>ÍxÉ</w:t>
-            </w:r>
-            <w:r>
-              <w:rPr>
-                <w:rFonts w:ascii="BRH Devanagari Extra" w:hAnsi="BRH Devanagari Extra" w:cs="BRH Devanagari Extra"/>
+              </w:rPr>
+              <w:t>ë</w:t>
+            </w:r>
+            <w:r>
+              <w:rPr>
+                <w:rFonts w:ascii="BRH Malayalam Extra" w:hAnsi="BRH Malayalam Extra" w:cs="BRH Devanagari Extra"/>
                 <w:color w:val="000000"/>
-                <w:sz w:val="32"/>
-                <w:szCs w:val="40"/>
-              </w:rPr>
-              <w:t>ë</w:t>
-            </w:r>
-            <w:r>
-              <w:rPr>
-                <w:rFonts w:ascii="BRH Malayalam Extra" w:hAnsi="BRH Malayalam Extra" w:cs="BRH Devanagari Extra"/>
+                <w:szCs w:val="40"/>
+              </w:rPr>
+              <w:t>–</w:t>
+            </w:r>
+            <w:r>
+              <w:rPr>
+                <w:rFonts w:ascii="BRH Devanagari Extra" w:hAnsi="BRH Devanagari Extra" w:cs="BRH Devanagari Extra"/>
                 <w:color w:val="000000"/>
-                <w:szCs w:val="40"/>
-              </w:rPr>
-              <w:t>–</w:t>
-            </w:r>
-            <w:r>
-              <w:rPr>
-                <w:rFonts w:ascii="BRH Devanagari Extra" w:hAnsi="BRH Devanagari Extra" w:cs="BRH Devanagari Extra"/>
+                <w:sz w:val="32"/>
+                <w:szCs w:val="40"/>
+              </w:rPr>
+              <w:t>rÉÉ</w:t>
+            </w:r>
+            <w:r>
+              <w:rPr>
+                <w:rFonts w:ascii="BRH Malayalam Extra" w:hAnsi="BRH Malayalam Extra" w:cs="BRH Devanagari Extra"/>
                 <w:color w:val="000000"/>
-                <w:sz w:val="32"/>
-                <w:szCs w:val="40"/>
-              </w:rPr>
-              <w:t>rÉÉ</w:t>
-            </w:r>
-            <w:r>
-              <w:rPr>
-                <w:rFonts w:ascii="BRH Malayalam Extra" w:hAnsi="BRH Malayalam Extra" w:cs="BRH Devanagari Extra"/>
+                <w:szCs w:val="40"/>
+              </w:rPr>
+              <w:t>–</w:t>
+            </w:r>
+            <w:r>
+              <w:rPr>
+                <w:rFonts w:ascii="BRH Devanagari Extra" w:hAnsi="BRH Devanagari Extra" w:cs="BRH Devanagari Extra"/>
                 <w:color w:val="000000"/>
-                <w:szCs w:val="40"/>
-              </w:rPr>
-              <w:t>–</w:t>
-            </w:r>
-            <w:r>
-              <w:rPr>
-                <w:rFonts w:ascii="BRH Devanagari Extra" w:hAnsi="BRH Devanagari Extra" w:cs="BRH Devanagari Extra"/>
+                <w:sz w:val="32"/>
+                <w:szCs w:val="40"/>
+              </w:rPr>
+              <w:t>ÎxuÉirÉÑ</w:t>
+            </w:r>
+            <w:r>
+              <w:rPr>
+                <w:rFonts w:ascii="BRH Malayalam Extra" w:hAnsi="BRH Malayalam Extra" w:cs="BRH Devanagari Extra"/>
                 <w:color w:val="000000"/>
-                <w:sz w:val="32"/>
-                <w:szCs w:val="40"/>
-              </w:rPr>
-              <w:t>ÎxuÉirÉÑ</w:t>
-            </w:r>
-            <w:r>
-              <w:rPr>
-                <w:rFonts w:ascii="BRH Malayalam Extra" w:hAnsi="BRH Malayalam Extra" w:cs="BRH Devanagari Extra"/>
+                <w:szCs w:val="40"/>
+              </w:rPr>
+              <w:t>–</w:t>
+            </w:r>
+            <w:r>
+              <w:rPr>
+                <w:rFonts w:ascii="BRH Devanagari Extra" w:hAnsi="BRH Devanagari Extra" w:cs="BRH Devanagari Extra"/>
                 <w:color w:val="000000"/>
-                <w:szCs w:val="40"/>
-              </w:rPr>
-              <w:t>–</w:t>
-            </w:r>
-            <w:r>
-              <w:rPr>
-                <w:rFonts w:ascii="BRH Devanagari Extra" w:hAnsi="BRH Devanagari Extra" w:cs="BRH Devanagari Extra"/>
-                <w:color w:val="000000"/>
                 <w:sz w:val="32"/>
                 <w:szCs w:val="40"/>
               </w:rPr>
               <w:t xml:space="preserve">ÍxÉërÉÉþxÉÑ | </w:t>
             </w:r>
-          </w:p>
-          <w:p>
-            <w:pPr>
-              <w:widowControl w:val="0"/>
-              <w:autoSpaceDE w:val="0"/>
-              <w:autoSpaceDN w:val="0"/>
-              <w:adjustRightInd w:val="0"/>
-              <w:spacing w:before="0" w:line="240" w:lineRule="auto"/>
-              <w:rPr>
-                <w:rFonts w:cs="BRH Malayalam Extra"/>
-                <w:szCs w:val="40"/>
-              </w:rPr>
-            </w:pPr>
           </w:p>
         </w:tc>
         <w:tc>
@@ -2308,81 +2263,291 @@
               <w:adjustRightInd w:val="0"/>
               <w:spacing w:line="240" w:lineRule="auto"/>
               <w:rPr>
+                <w:rFonts w:cs="BRH Malayalam Extra"/>
+                <w:szCs w:val="40"/>
+              </w:rPr>
+            </w:pPr>
+            <w:r>
+              <w:rPr>
                 <w:rFonts w:ascii="BRH Devanagari Extra" w:hAnsi="BRH Devanagari Extra" w:cs="BRH Devanagari Extra"/>
                 <w:color w:val="000000"/>
                 <w:sz w:val="32"/>
                 <w:szCs w:val="40"/>
               </w:rPr>
+              <w:t>E</w:t>
+            </w:r>
+            <w:r>
+              <w:rPr>
+                <w:rFonts w:ascii="BRH Malayalam Extra" w:hAnsi="BRH Malayalam Extra" w:cs="BRH Devanagari Extra"/>
+                <w:color w:val="000000"/>
+                <w:szCs w:val="40"/>
+              </w:rPr>
+              <w:t>–</w:t>
+            </w:r>
+            <w:r>
+              <w:rPr>
+                <w:rFonts w:ascii="BRH Devanagari Extra" w:hAnsi="BRH Devanagari Extra" w:cs="BRH Devanagari Extra"/>
+                <w:color w:val="000000"/>
+                <w:sz w:val="32"/>
+                <w:szCs w:val="40"/>
+                <w:highlight w:val="green"/>
+              </w:rPr>
+              <w:t>ÍxÉ</w:t>
+            </w:r>
+            <w:r>
+              <w:rPr>
+                <w:rFonts w:ascii="BRH Devanagari Extra" w:hAnsi="BRH Devanagari Extra" w:cs="BRH Devanagari Extra"/>
+                <w:color w:val="000000"/>
+                <w:sz w:val="32"/>
+                <w:szCs w:val="40"/>
+              </w:rPr>
+              <w:t>ërÉÉ</w:t>
+            </w:r>
+            <w:r>
+              <w:rPr>
+                <w:rFonts w:ascii="BRH Malayalam Extra" w:hAnsi="BRH Malayalam Extra" w:cs="BRH Devanagari Extra"/>
+                <w:color w:val="000000"/>
+                <w:szCs w:val="40"/>
+              </w:rPr>
+              <w:t>–</w:t>
+            </w:r>
+            <w:r>
+              <w:rPr>
+                <w:rFonts w:ascii="BRH Devanagari Extra" w:hAnsi="BRH Devanagari Extra" w:cs="BRH Devanagari Extra"/>
+                <w:color w:val="000000"/>
+                <w:sz w:val="32"/>
+                <w:szCs w:val="40"/>
+              </w:rPr>
+              <w:t>ÎxuÉirÉÑ</w:t>
+            </w:r>
+            <w:r>
+              <w:rPr>
+                <w:rFonts w:ascii="BRH Malayalam Extra" w:hAnsi="BRH Malayalam Extra" w:cs="BRH Devanagari Extra"/>
+                <w:color w:val="000000"/>
+                <w:szCs w:val="40"/>
+              </w:rPr>
+              <w:t>–</w:t>
+            </w:r>
+            <w:r>
+              <w:rPr>
+                <w:rFonts w:ascii="BRH Devanagari Extra" w:hAnsi="BRH Devanagari Extra" w:cs="BRH Devanagari Extra"/>
+                <w:color w:val="000000"/>
+                <w:sz w:val="32"/>
+                <w:szCs w:val="40"/>
+              </w:rPr>
+              <w:t xml:space="preserve">ÍxÉërÉÉþxÉÑ | </w:t>
+            </w:r>
+          </w:p>
+        </w:tc>
+      </w:tr>
+      <w:tr>
+        <w:trPr>
+          <w:trHeight w:val="1751"/>
+        </w:trPr>
+        <w:tc>
+          <w:tcPr>
+            <w:tcW w:w="7379" w:type="dxa"/>
+          </w:tcPr>
+          <w:p>
+            <w:pPr>
+              <w:widowControl w:val="0"/>
+              <w:autoSpaceDE w:val="0"/>
+              <w:autoSpaceDN w:val="0"/>
+              <w:adjustRightInd w:val="0"/>
+              <w:spacing w:line="240" w:lineRule="auto"/>
+              <w:rPr>
+                <w:rFonts w:ascii="BRH Devanagari Extra" w:hAnsi="BRH Devanagari Extra" w:cs="BRH Devanagari Extra"/>
+                <w:sz w:val="32"/>
+                <w:szCs w:val="40"/>
+              </w:rPr>
             </w:pPr>
             <w:r>
               <w:rPr>
-                <w:rFonts w:ascii="BRH Devanagari Extra" w:hAnsi="BRH Devanagari Extra" w:cs="BRH Devanagari Extra"/>
-                <w:color w:val="000000"/>
-                <w:sz w:val="32"/>
-                <w:szCs w:val="40"/>
-              </w:rPr>
-              <w:t>E</w:t>
-            </w:r>
-            <w:r>
-              <w:rPr>
-                <w:rFonts w:ascii="BRH Malayalam Extra" w:hAnsi="BRH Malayalam Extra" w:cs="BRH Devanagari Extra"/>
-                <w:color w:val="000000"/>
-                <w:szCs w:val="40"/>
-              </w:rPr>
-              <w:t>–</w:t>
-            </w:r>
-            <w:r>
-              <w:rPr>
-                <w:rFonts w:ascii="BRH Devanagari Extra" w:hAnsi="BRH Devanagari Extra" w:cs="BRH Devanagari Extra"/>
-                <w:color w:val="000000"/>
-                <w:sz w:val="32"/>
-                <w:szCs w:val="40"/>
-                <w:highlight w:val="green"/>
-              </w:rPr>
-              <w:t>ÍxÉ</w:t>
-            </w:r>
-            <w:r>
-              <w:rPr>
-                <w:rFonts w:ascii="BRH Devanagari Extra" w:hAnsi="BRH Devanagari Extra" w:cs="BRH Devanagari Extra"/>
-                <w:color w:val="000000"/>
-                <w:sz w:val="32"/>
-                <w:szCs w:val="40"/>
-              </w:rPr>
-              <w:t>ërÉÉ</w:t>
-            </w:r>
-            <w:r>
-              <w:rPr>
-                <w:rFonts w:ascii="BRH Malayalam Extra" w:hAnsi="BRH Malayalam Extra" w:cs="BRH Devanagari Extra"/>
-                <w:color w:val="000000"/>
-                <w:szCs w:val="40"/>
-              </w:rPr>
-              <w:t>–</w:t>
-            </w:r>
-            <w:r>
-              <w:rPr>
-                <w:rFonts w:ascii="BRH Devanagari Extra" w:hAnsi="BRH Devanagari Extra" w:cs="BRH Devanagari Extra"/>
-                <w:color w:val="000000"/>
-                <w:sz w:val="32"/>
-                <w:szCs w:val="40"/>
-              </w:rPr>
-              <w:t>ÎxuÉirÉÑ</w:t>
-            </w:r>
-            <w:r>
-              <w:rPr>
-                <w:rFonts w:ascii="BRH Malayalam Extra" w:hAnsi="BRH Malayalam Extra" w:cs="BRH Devanagari Extra"/>
-                <w:color w:val="000000"/>
-                <w:szCs w:val="40"/>
-              </w:rPr>
-              <w:t>–</w:t>
-            </w:r>
-            <w:r>
-              <w:rPr>
-                <w:rFonts w:ascii="BRH Devanagari Extra" w:hAnsi="BRH Devanagari Extra" w:cs="BRH Devanagari Extra"/>
-                <w:color w:val="000000"/>
-                <w:sz w:val="32"/>
-                <w:szCs w:val="40"/>
-              </w:rPr>
-              <w:t xml:space="preserve">ÍxÉërÉÉþxÉÑ | </w:t>
+                <w:rFonts w:cs="BRH Devanagari Extra"/>
+                <w:szCs w:val="40"/>
+              </w:rPr>
+              <w:t>22</w:t>
+            </w:r>
+            <w:r>
+              <w:rPr>
+                <w:rFonts w:ascii="BRH Devanagari Extra" w:hAnsi="BRH Devanagari Extra" w:cs="BRH Devanagari Extra"/>
+                <w:sz w:val="32"/>
+                <w:szCs w:val="40"/>
+              </w:rPr>
+              <w:t>)</w:t>
+            </w:r>
+            <w:r>
+              <w:rPr>
+                <w:rFonts w:ascii="BRH Devanagari Extra" w:hAnsi="BRH Devanagari Extra" w:cs="BRH Devanagari Extra"/>
+                <w:sz w:val="32"/>
+                <w:szCs w:val="40"/>
+              </w:rPr>
+              <w:tab/>
+            </w:r>
+            <w:r>
+              <w:rPr>
+                <w:rFonts w:cs="BRH Devanagari Extra"/>
+                <w:szCs w:val="40"/>
+              </w:rPr>
+              <w:t>1</w:t>
+            </w:r>
+            <w:r>
+              <w:rPr>
+                <w:rFonts w:ascii="BRH Devanagari Extra" w:hAnsi="BRH Devanagari Extra" w:cs="BRH Devanagari Extra"/>
+                <w:sz w:val="32"/>
+                <w:szCs w:val="40"/>
+              </w:rPr>
+              <w:t>.</w:t>
+            </w:r>
+            <w:r>
+              <w:rPr>
+                <w:rFonts w:cs="BRH Devanagari Extra"/>
+                <w:szCs w:val="40"/>
+              </w:rPr>
+              <w:t>8</w:t>
+            </w:r>
+            <w:r>
+              <w:rPr>
+                <w:rFonts w:ascii="BRH Devanagari Extra" w:hAnsi="BRH Devanagari Extra" w:cs="BRH Devanagari Extra"/>
+                <w:sz w:val="32"/>
+                <w:szCs w:val="40"/>
+              </w:rPr>
+              <w:t>.</w:t>
+            </w:r>
+            <w:r>
+              <w:rPr>
+                <w:rFonts w:cs="BRH Devanagari Extra"/>
+                <w:szCs w:val="40"/>
+              </w:rPr>
+              <w:t>3</w:t>
+            </w:r>
+            <w:r>
+              <w:rPr>
+                <w:rFonts w:ascii="BRH Devanagari Extra" w:hAnsi="BRH Devanagari Extra" w:cs="BRH Devanagari Extra"/>
+                <w:sz w:val="32"/>
+                <w:szCs w:val="40"/>
+              </w:rPr>
+              <w:t>.</w:t>
+            </w:r>
+            <w:r>
+              <w:rPr>
+                <w:rFonts w:cs="BRH Devanagari Extra"/>
+                <w:szCs w:val="40"/>
+              </w:rPr>
+              <w:t>1</w:t>
+            </w:r>
+            <w:r>
+              <w:rPr>
+                <w:rFonts w:ascii="BRH Devanagari Extra" w:hAnsi="BRH Devanagari Extra" w:cs="BRH Devanagari Extra"/>
+                <w:sz w:val="32"/>
+                <w:szCs w:val="40"/>
+              </w:rPr>
+              <w:t>(</w:t>
+            </w:r>
+            <w:r>
+              <w:rPr>
+                <w:rFonts w:cs="BRH Devanagari Extra"/>
+                <w:szCs w:val="40"/>
+              </w:rPr>
+              <w:t>16</w:t>
+            </w:r>
+            <w:r>
+              <w:rPr>
+                <w:rFonts w:ascii="BRH Devanagari Extra" w:hAnsi="BRH Devanagari Extra" w:cs="BRH Devanagari Extra"/>
+                <w:sz w:val="32"/>
+                <w:szCs w:val="40"/>
+              </w:rPr>
+              <w:t>)-  xÉÑ | lÉ</w:t>
+            </w:r>
+            <w:r>
+              <w:rPr>
+                <w:rFonts w:ascii="BRH Malayalam Extra" w:hAnsi="BRH Malayalam Extra" w:cs="BRH Devanagari Extra"/>
+                <w:szCs w:val="40"/>
+              </w:rPr>
+              <w:t>–</w:t>
+            </w:r>
+            <w:r>
+              <w:rPr>
+                <w:rFonts w:ascii="BRH Devanagari Extra" w:hAnsi="BRH Devanagari Extra" w:cs="BRH Devanagari Extra"/>
+                <w:sz w:val="32"/>
+                <w:szCs w:val="40"/>
+              </w:rPr>
+              <w:t>È | C</w:t>
+            </w:r>
+            <w:r>
+              <w:rPr>
+                <w:rFonts w:ascii="BRH Malayalam Extra" w:hAnsi="BRH Malayalam Extra" w:cs="BRH Devanagari Extra"/>
+                <w:szCs w:val="40"/>
+              </w:rPr>
+              <w:t>–</w:t>
+            </w:r>
+            <w:r>
+              <w:rPr>
+                <w:rFonts w:ascii="BRH Devanagari Extra" w:hAnsi="BRH Devanagari Extra" w:cs="BRH Devanagari Extra"/>
+                <w:sz w:val="32"/>
+                <w:szCs w:val="40"/>
+              </w:rPr>
+              <w:t>lSì</w:t>
+            </w:r>
+            <w:r>
+              <w:rPr>
+                <w:rFonts w:ascii="BRH Malayalam Extra" w:hAnsi="BRH Malayalam Extra" w:cs="BRH Devanagari Extra"/>
+                <w:szCs w:val="40"/>
+              </w:rPr>
+              <w:t>–</w:t>
+            </w:r>
+            <w:r>
+              <w:rPr>
+                <w:rFonts w:ascii="BRH Devanagari Extra" w:hAnsi="BRH Devanagari Extra" w:cs="BRH Devanagari Extra"/>
+                <w:sz w:val="32"/>
+                <w:szCs w:val="40"/>
+              </w:rPr>
+              <w:t xml:space="preserve"> | (</w:t>
+            </w:r>
+            <w:r>
+              <w:rPr>
+                <w:rFonts w:cs="BRH Devanagari Extra"/>
+                <w:szCs w:val="40"/>
+              </w:rPr>
+              <w:t>GS1</w:t>
+            </w:r>
+            <w:r>
+              <w:rPr>
+                <w:rFonts w:ascii="BRH Devanagari Extra" w:hAnsi="BRH Devanagari Extra" w:cs="BRH Devanagari Extra"/>
+                <w:sz w:val="32"/>
+                <w:szCs w:val="40"/>
+              </w:rPr>
+              <w:t>.</w:t>
+            </w:r>
+            <w:r>
+              <w:rPr>
+                <w:rFonts w:cs="BRH Devanagari Extra"/>
+                <w:szCs w:val="40"/>
+              </w:rPr>
+              <w:t>8</w:t>
+            </w:r>
+            <w:r>
+              <w:rPr>
+                <w:rFonts w:ascii="BRH Devanagari Extra" w:hAnsi="BRH Devanagari Extra" w:cs="BRH Devanagari Extra"/>
+                <w:sz w:val="32"/>
+                <w:szCs w:val="40"/>
+              </w:rPr>
+              <w:t>-</w:t>
+            </w:r>
+            <w:r>
+              <w:rPr>
+                <w:rFonts w:cs="BRH Devanagari Extra"/>
+                <w:szCs w:val="40"/>
+              </w:rPr>
+              <w:t>2</w:t>
+            </w:r>
+            <w:r>
+              <w:rPr>
+                <w:rFonts w:ascii="BRH Devanagari Extra" w:hAnsi="BRH Devanagari Extra" w:cs="BRH Devanagari Extra"/>
+                <w:sz w:val="32"/>
+                <w:szCs w:val="40"/>
+              </w:rPr>
+              <w:t>)</w:t>
             </w:r>
           </w:p>
           <w:p>
@@ -2391,12 +2556,404 @@
               <w:autoSpaceDE w:val="0"/>
               <w:autoSpaceDN w:val="0"/>
               <w:adjustRightInd w:val="0"/>
-              <w:spacing w:before="0" w:line="240" w:lineRule="auto"/>
-              <w:rPr>
-                <w:rFonts w:cs="BRH Malayalam Extra"/>
+              <w:spacing w:line="240" w:lineRule="auto"/>
+              <w:rPr>
+                <w:rFonts w:cs="BRH Devanagari Extra"/>
+                <w:color w:val="000000"/>
                 <w:szCs w:val="40"/>
               </w:rPr>
             </w:pPr>
+            <w:r>
+              <w:rPr>
+                <w:rFonts w:ascii="BRH Devanagari Extra" w:hAnsi="BRH Devanagari Extra" w:cs="BRH Devanagari Extra"/>
+                <w:sz w:val="32"/>
+                <w:szCs w:val="40"/>
+                <w:highlight w:val="yellow"/>
+              </w:rPr>
+              <w:t>xÉÑ lÉÉåþ</w:t>
+            </w:r>
+            <w:r>
+              <w:rPr>
+                <w:rFonts w:ascii="BRH Devanagari Extra" w:hAnsi="BRH Devanagari Extra" w:cs="BRH Devanagari Extra"/>
+                <w:sz w:val="32"/>
+                <w:szCs w:val="40"/>
+              </w:rPr>
+              <w:t xml:space="preserve"> lÉ</w:t>
+            </w:r>
+            <w:r>
+              <w:rPr>
+                <w:rFonts w:ascii="BRH Malayalam Extra" w:hAnsi="BRH Malayalam Extra" w:cs="BRH Devanagari Extra"/>
+                <w:szCs w:val="40"/>
+              </w:rPr>
+              <w:t>–</w:t>
+            </w:r>
+            <w:r>
+              <w:rPr>
+                <w:rFonts w:ascii="BRH Devanagari Extra" w:hAnsi="BRH Devanagari Extra" w:cs="BRH Devanagari Extra"/>
+                <w:sz w:val="32"/>
+                <w:szCs w:val="40"/>
+              </w:rPr>
+              <w:t xml:space="preserve">È xÉÑ </w:t>
+            </w:r>
+            <w:r>
+              <w:rPr>
+                <w:rFonts w:ascii="BRH Devanagari Extra" w:hAnsi="BRH Devanagari Extra" w:cs="BRH Devanagari Extra"/>
+                <w:sz w:val="32"/>
+                <w:szCs w:val="40"/>
+                <w:highlight w:val="yellow"/>
+              </w:rPr>
+              <w:t>xÉÑ l</w:t>
+            </w:r>
+            <w:r>
+              <w:rPr>
+                <w:rFonts w:ascii="BRH Devanagari Extra" w:hAnsi="BRH Devanagari Extra" w:cs="BRH Devanagari Extra"/>
+                <w:sz w:val="32"/>
+                <w:szCs w:val="40"/>
+              </w:rPr>
+              <w:t>Éþ ClSìålSì lÉ</w:t>
+            </w:r>
+            <w:r>
+              <w:rPr>
+                <w:rFonts w:ascii="BRH Malayalam Extra" w:hAnsi="BRH Malayalam Extra" w:cs="BRH Devanagari Extra"/>
+                <w:szCs w:val="40"/>
+              </w:rPr>
+              <w:t>–</w:t>
+            </w:r>
+            <w:r>
+              <w:rPr>
+                <w:rFonts w:ascii="BRH Devanagari Extra" w:hAnsi="BRH Devanagari Extra" w:cs="BRH Devanagari Extra"/>
+                <w:sz w:val="32"/>
+                <w:szCs w:val="40"/>
+              </w:rPr>
+              <w:t xml:space="preserve">È xÉÑ </w:t>
+            </w:r>
+            <w:r>
+              <w:rPr>
+                <w:rFonts w:ascii="BRH Devanagari Extra" w:hAnsi="BRH Devanagari Extra" w:cs="BRH Devanagari Extra"/>
+                <w:sz w:val="32"/>
+                <w:szCs w:val="40"/>
+                <w:highlight w:val="yellow"/>
+              </w:rPr>
+              <w:t>xÉÑ lÉþ</w:t>
+            </w:r>
+            <w:r>
+              <w:rPr>
+                <w:rFonts w:ascii="BRH Devanagari Extra" w:hAnsi="BRH Devanagari Extra" w:cs="BRH Devanagari Extra"/>
+                <w:sz w:val="32"/>
+                <w:szCs w:val="40"/>
+              </w:rPr>
+              <w:t xml:space="preserve"> ClSì | </w:t>
+            </w:r>
+          </w:p>
+        </w:tc>
+        <w:tc>
+          <w:tcPr>
+            <w:tcW w:w="7300" w:type="dxa"/>
+          </w:tcPr>
+          <w:p>
+            <w:pPr>
+              <w:widowControl w:val="0"/>
+              <w:autoSpaceDE w:val="0"/>
+              <w:autoSpaceDN w:val="0"/>
+              <w:adjustRightInd w:val="0"/>
+              <w:spacing w:line="240" w:lineRule="auto"/>
+              <w:rPr>
+                <w:rFonts w:ascii="BRH Devanagari Extra" w:hAnsi="BRH Devanagari Extra" w:cs="BRH Devanagari Extra"/>
+                <w:sz w:val="32"/>
+                <w:szCs w:val="40"/>
+              </w:rPr>
+            </w:pPr>
+            <w:r>
+              <w:rPr>
+                <w:rFonts w:cs="BRH Devanagari Extra"/>
+                <w:szCs w:val="40"/>
+              </w:rPr>
+              <w:t>22</w:t>
+            </w:r>
+            <w:r>
+              <w:rPr>
+                <w:rFonts w:ascii="BRH Devanagari Extra" w:hAnsi="BRH Devanagari Extra" w:cs="BRH Devanagari Extra"/>
+                <w:sz w:val="32"/>
+                <w:szCs w:val="40"/>
+              </w:rPr>
+              <w:t>)</w:t>
+            </w:r>
+            <w:r>
+              <w:rPr>
+                <w:rFonts w:ascii="BRH Devanagari Extra" w:hAnsi="BRH Devanagari Extra" w:cs="BRH Devanagari Extra"/>
+                <w:sz w:val="32"/>
+                <w:szCs w:val="40"/>
+              </w:rPr>
+              <w:tab/>
+            </w:r>
+            <w:r>
+              <w:rPr>
+                <w:rFonts w:cs="BRH Devanagari Extra"/>
+                <w:szCs w:val="40"/>
+              </w:rPr>
+              <w:t>1</w:t>
+            </w:r>
+            <w:r>
+              <w:rPr>
+                <w:rFonts w:ascii="BRH Devanagari Extra" w:hAnsi="BRH Devanagari Extra" w:cs="BRH Devanagari Extra"/>
+                <w:sz w:val="32"/>
+                <w:szCs w:val="40"/>
+              </w:rPr>
+              <w:t>.</w:t>
+            </w:r>
+            <w:r>
+              <w:rPr>
+                <w:rFonts w:cs="BRH Devanagari Extra"/>
+                <w:szCs w:val="40"/>
+              </w:rPr>
+              <w:t>8</w:t>
+            </w:r>
+            <w:r>
+              <w:rPr>
+                <w:rFonts w:ascii="BRH Devanagari Extra" w:hAnsi="BRH Devanagari Extra" w:cs="BRH Devanagari Extra"/>
+                <w:sz w:val="32"/>
+                <w:szCs w:val="40"/>
+              </w:rPr>
+              <w:t>.</w:t>
+            </w:r>
+            <w:r>
+              <w:rPr>
+                <w:rFonts w:cs="BRH Devanagari Extra"/>
+                <w:szCs w:val="40"/>
+              </w:rPr>
+              <w:t>3</w:t>
+            </w:r>
+            <w:r>
+              <w:rPr>
+                <w:rFonts w:ascii="BRH Devanagari Extra" w:hAnsi="BRH Devanagari Extra" w:cs="BRH Devanagari Extra"/>
+                <w:sz w:val="32"/>
+                <w:szCs w:val="40"/>
+              </w:rPr>
+              <w:t>.</w:t>
+            </w:r>
+            <w:r>
+              <w:rPr>
+                <w:rFonts w:cs="BRH Devanagari Extra"/>
+                <w:szCs w:val="40"/>
+              </w:rPr>
+              <w:t>1</w:t>
+            </w:r>
+            <w:r>
+              <w:rPr>
+                <w:rFonts w:ascii="BRH Devanagari Extra" w:hAnsi="BRH Devanagari Extra" w:cs="BRH Devanagari Extra"/>
+                <w:sz w:val="32"/>
+                <w:szCs w:val="40"/>
+              </w:rPr>
+              <w:t>(</w:t>
+            </w:r>
+            <w:r>
+              <w:rPr>
+                <w:rFonts w:cs="BRH Devanagari Extra"/>
+                <w:szCs w:val="40"/>
+              </w:rPr>
+              <w:t>16</w:t>
+            </w:r>
+            <w:r>
+              <w:rPr>
+                <w:rFonts w:ascii="BRH Devanagari Extra" w:hAnsi="BRH Devanagari Extra" w:cs="BRH Devanagari Extra"/>
+                <w:sz w:val="32"/>
+                <w:szCs w:val="40"/>
+              </w:rPr>
+              <w:t>)-  xÉÑ | lÉ</w:t>
+            </w:r>
+            <w:r>
+              <w:rPr>
+                <w:rFonts w:ascii="BRH Malayalam Extra" w:hAnsi="BRH Malayalam Extra" w:cs="BRH Devanagari Extra"/>
+                <w:szCs w:val="40"/>
+              </w:rPr>
+              <w:t>–</w:t>
+            </w:r>
+            <w:r>
+              <w:rPr>
+                <w:rFonts w:ascii="BRH Devanagari Extra" w:hAnsi="BRH Devanagari Extra" w:cs="BRH Devanagari Extra"/>
+                <w:sz w:val="32"/>
+                <w:szCs w:val="40"/>
+              </w:rPr>
+              <w:t>È | C</w:t>
+            </w:r>
+            <w:r>
+              <w:rPr>
+                <w:rFonts w:ascii="BRH Malayalam Extra" w:hAnsi="BRH Malayalam Extra" w:cs="BRH Devanagari Extra"/>
+                <w:szCs w:val="40"/>
+              </w:rPr>
+              <w:t>–</w:t>
+            </w:r>
+            <w:r>
+              <w:rPr>
+                <w:rFonts w:ascii="BRH Devanagari Extra" w:hAnsi="BRH Devanagari Extra" w:cs="BRH Devanagari Extra"/>
+                <w:sz w:val="32"/>
+                <w:szCs w:val="40"/>
+              </w:rPr>
+              <w:t>lSì</w:t>
+            </w:r>
+            <w:r>
+              <w:rPr>
+                <w:rFonts w:ascii="BRH Malayalam Extra" w:hAnsi="BRH Malayalam Extra" w:cs="BRH Devanagari Extra"/>
+                <w:szCs w:val="40"/>
+              </w:rPr>
+              <w:t>–</w:t>
+            </w:r>
+            <w:r>
+              <w:rPr>
+                <w:rFonts w:ascii="BRH Devanagari Extra" w:hAnsi="BRH Devanagari Extra" w:cs="BRH Devanagari Extra"/>
+                <w:sz w:val="32"/>
+                <w:szCs w:val="40"/>
+              </w:rPr>
+              <w:t xml:space="preserve"> | (</w:t>
+            </w:r>
+            <w:r>
+              <w:rPr>
+                <w:rFonts w:cs="BRH Devanagari Extra"/>
+                <w:szCs w:val="40"/>
+              </w:rPr>
+              <w:t>GS1</w:t>
+            </w:r>
+            <w:r>
+              <w:rPr>
+                <w:rFonts w:ascii="BRH Devanagari Extra" w:hAnsi="BRH Devanagari Extra" w:cs="BRH Devanagari Extra"/>
+                <w:sz w:val="32"/>
+                <w:szCs w:val="40"/>
+              </w:rPr>
+              <w:t>.</w:t>
+            </w:r>
+            <w:r>
+              <w:rPr>
+                <w:rFonts w:cs="BRH Devanagari Extra"/>
+                <w:szCs w:val="40"/>
+              </w:rPr>
+              <w:t>8</w:t>
+            </w:r>
+            <w:r>
+              <w:rPr>
+                <w:rFonts w:ascii="BRH Devanagari Extra" w:hAnsi="BRH Devanagari Extra" w:cs="BRH Devanagari Extra"/>
+                <w:sz w:val="32"/>
+                <w:szCs w:val="40"/>
+              </w:rPr>
+              <w:t>-</w:t>
+            </w:r>
+            <w:r>
+              <w:rPr>
+                <w:rFonts w:cs="BRH Devanagari Extra"/>
+                <w:szCs w:val="40"/>
+              </w:rPr>
+              <w:t>2</w:t>
+            </w:r>
+            <w:r>
+              <w:rPr>
+                <w:rFonts w:ascii="BRH Devanagari Extra" w:hAnsi="BRH Devanagari Extra" w:cs="BRH Devanagari Extra"/>
+                <w:sz w:val="32"/>
+                <w:szCs w:val="40"/>
+              </w:rPr>
+              <w:t>)</w:t>
+            </w:r>
+          </w:p>
+          <w:p>
+            <w:pPr>
+              <w:widowControl w:val="0"/>
+              <w:autoSpaceDE w:val="0"/>
+              <w:autoSpaceDN w:val="0"/>
+              <w:adjustRightInd w:val="0"/>
+              <w:spacing w:line="240" w:lineRule="auto"/>
+              <w:rPr>
+                <w:rFonts w:cs="BRH Devanagari Extra"/>
+                <w:color w:val="000000"/>
+                <w:szCs w:val="40"/>
+              </w:rPr>
+            </w:pPr>
+            <w:r>
+              <w:rPr>
+                <w:rFonts w:ascii="BRH Devanagari Extra" w:hAnsi="BRH Devanagari Extra" w:cs="BRH Devanagari Extra"/>
+                <w:sz w:val="32"/>
+                <w:szCs w:val="40"/>
+                <w:highlight w:val="green"/>
+              </w:rPr>
+              <w:t>xÉ</w:t>
+            </w:r>
+            <w:r>
+              <w:rPr>
+                <w:rFonts w:ascii="BRH Devanagari Extra" w:hAnsi="BRH Devanagari Extra" w:cs="BRH Devanagari Extra"/>
+                <w:sz w:val="32"/>
+                <w:szCs w:val="40"/>
+              </w:rPr>
+              <w:t>Ô lÉÉåþ lÉ</w:t>
+            </w:r>
+            <w:r>
+              <w:rPr>
+                <w:rFonts w:ascii="BRH Malayalam Extra" w:hAnsi="BRH Malayalam Extra" w:cs="BRH Devanagari Extra"/>
+                <w:szCs w:val="40"/>
+              </w:rPr>
+              <w:t>–</w:t>
+            </w:r>
+            <w:r>
+              <w:rPr>
+                <w:rFonts w:ascii="BRH Devanagari Extra" w:hAnsi="BRH Devanagari Extra" w:cs="BRH Devanagari Extra"/>
+                <w:sz w:val="32"/>
+                <w:szCs w:val="40"/>
+              </w:rPr>
+              <w:t xml:space="preserve">È xÉÑ </w:t>
+            </w:r>
+            <w:r>
+              <w:rPr>
+                <w:rFonts w:ascii="BRH Devanagari Extra" w:hAnsi="BRH Devanagari Extra" w:cs="BRH Devanagari Extra"/>
+                <w:sz w:val="32"/>
+                <w:szCs w:val="40"/>
+                <w:highlight w:val="green"/>
+              </w:rPr>
+              <w:t>xÉ</w:t>
+            </w:r>
+            <w:r>
+              <w:rPr>
+                <w:rFonts w:ascii="BRH Devanagari Extra" w:hAnsi="BRH Devanagari Extra" w:cs="BRH Devanagari Extra"/>
+                <w:sz w:val="32"/>
+                <w:szCs w:val="40"/>
+              </w:rPr>
+              <w:t>Ñ lÉþ ClSìålSì lÉ</w:t>
+            </w:r>
+            <w:r>
+              <w:rPr>
+                <w:rFonts w:ascii="BRH Malayalam Extra" w:hAnsi="BRH Malayalam Extra" w:cs="BRH Devanagari Extra"/>
+                <w:szCs w:val="40"/>
+              </w:rPr>
+              <w:t>–</w:t>
+            </w:r>
+            <w:r>
+              <w:rPr>
+                <w:rFonts w:ascii="BRH Devanagari Extra" w:hAnsi="BRH Devanagari Extra" w:cs="BRH Devanagari Extra"/>
+                <w:sz w:val="32"/>
+                <w:szCs w:val="40"/>
+              </w:rPr>
+              <w:t xml:space="preserve">È xÉÑ </w:t>
+            </w:r>
+            <w:r>
+              <w:rPr>
+                <w:rFonts w:ascii="BRH Devanagari Extra" w:hAnsi="BRH Devanagari Extra" w:cs="BRH Devanagari Extra"/>
+                <w:sz w:val="32"/>
+                <w:szCs w:val="40"/>
+                <w:highlight w:val="green"/>
+              </w:rPr>
+              <w:t>xÉ</w:t>
+            </w:r>
+            <w:r>
+              <w:rPr>
+                <w:rFonts w:ascii="BRH Devanagari Extra" w:hAnsi="BRH Devanagari Extra" w:cs="BRH Devanagari Extra"/>
+                <w:sz w:val="32"/>
+                <w:szCs w:val="40"/>
+              </w:rPr>
+              <w:t>Ñ lÉþ ClSì |</w:t>
+            </w:r>
+            <w:r>
+              <w:rPr>
+                <w:rFonts w:ascii="BRH Devanagari Extra" w:hAnsi="BRH Devanagari Extra" w:cs="BRH Devanagari Extra"/>
+                <w:sz w:val="32"/>
+                <w:szCs w:val="40"/>
+              </w:rPr>
+              <w:t xml:space="preserve"> </w:t>
+            </w:r>
           </w:p>
         </w:tc>
       </w:tr>
@@ -2580,7 +3137,6 @@
                 <w:sz w:val="32"/>
                 <w:szCs w:val="32"/>
               </w:rPr>
-              <w:lastRenderedPageBreak/>
               <w:t>As Printed</w:t>
             </w:r>
           </w:p>
@@ -5070,6 +5626,7 @@
                 <w:rFonts w:cs="BRH Devanagari Extra"/>
                 <w:szCs w:val="40"/>
               </w:rPr>
+              <w:lastRenderedPageBreak/>
               <w:t>10</w:t>
             </w:r>
             <w:r>
@@ -5415,16 +5972,7 @@
                 <w:sz w:val="32"/>
                 <w:szCs w:val="40"/>
               </w:rPr>
-              <w:t xml:space="preserve"> qÉåMüþMümÉÉsÉqÉç </w:t>
-            </w:r>
-            <w:r>
-              <w:rPr>
-                <w:rFonts w:ascii="BRH Devanagari Extra" w:hAnsi="BRH Devanagari Extra" w:cs="BRH Devanagari Extra"/>
-                <w:sz w:val="32"/>
-                <w:szCs w:val="40"/>
-              </w:rPr>
-              <w:lastRenderedPageBreak/>
-              <w:t>mÉëbÉÉ</w:t>
+              <w:t xml:space="preserve"> qÉåMüþMümÉÉsÉqÉç mÉëbÉÉ</w:t>
             </w:r>
             <w:r>
               <w:rPr>
@@ -5908,7 +6456,6 @@
                 <w:rFonts w:cs="BRH Devanagari Extra"/>
                 <w:szCs w:val="40"/>
               </w:rPr>
-              <w:lastRenderedPageBreak/>
               <w:t>10</w:t>
             </w:r>
             <w:r>
@@ -6271,16 +6818,7 @@
                 <w:sz w:val="32"/>
                 <w:szCs w:val="40"/>
               </w:rPr>
-              <w:t xml:space="preserve"> qÉåMüþMümÉÉsÉqÉç </w:t>
-            </w:r>
-            <w:r>
-              <w:rPr>
-                <w:rFonts w:ascii="BRH Devanagari Extra" w:hAnsi="BRH Devanagari Extra" w:cs="BRH Devanagari Extra"/>
-                <w:sz w:val="32"/>
-                <w:szCs w:val="40"/>
-              </w:rPr>
-              <w:lastRenderedPageBreak/>
-              <w:t>mÉëbÉÉ</w:t>
+              <w:t xml:space="preserve"> qÉåMüþMümÉÉsÉqÉç mÉëbÉÉ</w:t>
             </w:r>
             <w:r>
               <w:rPr>
@@ -6798,7 +7336,6 @@
                 <w:szCs w:val="40"/>
                 <w:lang w:val="it-IT"/>
               </w:rPr>
-              <w:lastRenderedPageBreak/>
               <w:t>22</w:t>
             </w:r>
             <w:r>
@@ -8237,7 +8774,17 @@
                 <w:szCs w:val="40"/>
                 <w:lang w:val="it-IT"/>
               </w:rPr>
-              <w:t xml:space="preserve"> mÉiÉ mÉiÉ</w:t>
+              <w:t xml:space="preserve"> mÉiÉ </w:t>
+            </w:r>
+            <w:r>
+              <w:rPr>
+                <w:rFonts w:ascii="BRH Devanagari Extra" w:hAnsi="BRH Devanagari Extra" w:cs="BRH Devanagari Extra"/>
+                <w:sz w:val="32"/>
+                <w:szCs w:val="40"/>
+                <w:lang w:val="it-IT"/>
+              </w:rPr>
+              <w:lastRenderedPageBreak/>
+              <w:t>mÉiÉ</w:t>
             </w:r>
             <w:r>
               <w:rPr>
@@ -8483,7 +9030,6 @@
                 <w:szCs w:val="40"/>
                 <w:lang w:val="it-IT"/>
               </w:rPr>
-              <w:lastRenderedPageBreak/>
               <w:t>xÉÑmÉÔÿhÉÉï</w:t>
             </w:r>
             <w:r>
@@ -9661,7 +10207,17 @@
                 <w:szCs w:val="40"/>
                 <w:lang w:val="it-IT"/>
               </w:rPr>
-              <w:t xml:space="preserve"> xÉÑmÉÔÿhÉÉï</w:t>
+              <w:t xml:space="preserve"> </w:t>
+            </w:r>
+            <w:r>
+              <w:rPr>
+                <w:rFonts w:ascii="BRH Devanagari Extra" w:hAnsi="BRH Devanagari Extra" w:cs="BRH Devanagari Extra"/>
+                <w:sz w:val="32"/>
+                <w:szCs w:val="40"/>
+                <w:lang w:val="it-IT"/>
+              </w:rPr>
+              <w:lastRenderedPageBreak/>
+              <w:t>xÉÑmÉÔÿhÉÉï</w:t>
             </w:r>
             <w:r>
               <w:rPr>
@@ -9862,7 +10418,6 @@
                 <w:szCs w:val="40"/>
                 <w:lang w:val="it-IT"/>
               </w:rPr>
-              <w:lastRenderedPageBreak/>
               <w:t>xÉÑmÉÔÿhÉÉï</w:t>
             </w:r>
             <w:r>
@@ -12091,6 +12646,7 @@
                 <w:szCs w:val="40"/>
                 <w:lang w:val="it-IT"/>
               </w:rPr>
+              <w:lastRenderedPageBreak/>
               <w:t>Så</w:t>
             </w:r>
             <w:r>
@@ -12146,7 +12702,6 @@
                 <w:szCs w:val="40"/>
                 <w:lang w:val="it-IT"/>
               </w:rPr>
-              <w:lastRenderedPageBreak/>
               <w:t>12</w:t>
             </w:r>
             <w:r>
@@ -12674,7 +13229,17 @@
                 <w:szCs w:val="40"/>
                 <w:lang w:val="it-IT"/>
               </w:rPr>
-              <w:t xml:space="preserve">uÉqÉç §rÉþÇoÉMüqÉç | </w:t>
+              <w:t xml:space="preserve">uÉqÉç </w:t>
+            </w:r>
+            <w:r>
+              <w:rPr>
+                <w:rFonts w:ascii="BRH Devanagari Extra" w:hAnsi="BRH Devanagari Extra" w:cs="BRH Devanagari Extra"/>
+                <w:sz w:val="32"/>
+                <w:szCs w:val="40"/>
+                <w:lang w:val="it-IT"/>
+              </w:rPr>
+              <w:lastRenderedPageBreak/>
+              <w:t xml:space="preserve">§rÉþÇoÉMüqÉç | </w:t>
             </w:r>
           </w:p>
           <w:p>
@@ -12712,7 +13277,6 @@
                 <w:szCs w:val="40"/>
                 <w:lang w:val="it-IT"/>
               </w:rPr>
-              <w:lastRenderedPageBreak/>
               <w:t>12</w:t>
             </w:r>
             <w:r>
@@ -14781,7 +15345,6 @@
                 <w:sz w:val="32"/>
                 <w:szCs w:val="40"/>
               </w:rPr>
-              <w:lastRenderedPageBreak/>
               <w:t>lÉæ</w:t>
             </w:r>
             <w:r>
@@ -16085,7 +16648,6 @@
                 <w:sz w:val="32"/>
                 <w:szCs w:val="40"/>
               </w:rPr>
-              <w:lastRenderedPageBreak/>
               <w:t>lÉæ</w:t>
             </w:r>
             <w:r>
@@ -18961,6 +19523,7 @@
                 <w:rFonts w:cs="BRH Devanagari Extra"/>
                 <w:szCs w:val="40"/>
               </w:rPr>
+              <w:lastRenderedPageBreak/>
               <w:t>28</w:t>
             </w:r>
             <w:r>
@@ -19326,7 +19889,6 @@
                 <w:rFonts w:cs="BRH Devanagari Extra"/>
                 <w:szCs w:val="40"/>
               </w:rPr>
-              <w:lastRenderedPageBreak/>
               <w:t>35</w:t>
             </w:r>
             <w:r>
@@ -21318,6 +21880,7 @@
                 <w:sz w:val="32"/>
                 <w:szCs w:val="40"/>
               </w:rPr>
+              <w:lastRenderedPageBreak/>
               <w:t>uÉåþÌS</w:t>
             </w:r>
             <w:r>
@@ -21451,7 +22014,6 @@
                 <w:rFonts w:cs="BRH Devanagari Extra"/>
                 <w:szCs w:val="40"/>
               </w:rPr>
-              <w:lastRenderedPageBreak/>
               <w:t>42</w:t>
             </w:r>
             <w:r>
@@ -22998,7 +23560,16 @@
                 <w:sz w:val="32"/>
                 <w:szCs w:val="40"/>
               </w:rPr>
-              <w:t>wÉSè uÉåþÌS</w:t>
+              <w:t xml:space="preserve">wÉSè </w:t>
+            </w:r>
+            <w:r>
+              <w:rPr>
+                <w:rFonts w:ascii="BRH Devanagari Extra" w:hAnsi="BRH Devanagari Extra" w:cs="BRH Devanagari Extra"/>
+                <w:sz w:val="32"/>
+                <w:szCs w:val="40"/>
+              </w:rPr>
+              <w:lastRenderedPageBreak/>
+              <w:t>uÉåþÌS</w:t>
             </w:r>
             <w:r>
               <w:rPr>
@@ -23133,7 +23704,6 @@
                 <w:szCs w:val="40"/>
                 <w:lang w:val="it-IT"/>
               </w:rPr>
-              <w:lastRenderedPageBreak/>
               <w:t>42</w:t>
             </w:r>
             <w:r>
@@ -25232,6 +25802,7 @@
                 <w:szCs w:val="40"/>
                 <w:lang w:val="it-IT"/>
               </w:rPr>
+              <w:lastRenderedPageBreak/>
               <w:t>C</w:t>
             </w:r>
             <w:r>
@@ -25441,7 +26012,6 @@
                 <w:szCs w:val="40"/>
                 <w:lang w:val="it-IT"/>
               </w:rPr>
-              <w:lastRenderedPageBreak/>
               <w:t>53</w:t>
             </w:r>
             <w:r>
@@ -27477,6 +28047,7 @@
                 <w:szCs w:val="40"/>
                 <w:lang w:val="it-IT"/>
               </w:rPr>
+              <w:lastRenderedPageBreak/>
               <w:t>C</w:t>
             </w:r>
             <w:r>
@@ -27696,7 +28267,6 @@
                 <w:szCs w:val="40"/>
                 <w:lang w:val="it-IT"/>
               </w:rPr>
-              <w:lastRenderedPageBreak/>
               <w:t>53</w:t>
             </w:r>
             <w:r>
@@ -30778,6 +31348,7 @@
           <w:szCs w:val="32"/>
           <w:u w:val="single"/>
         </w:rPr>
+        <w:lastRenderedPageBreak/>
         <w:t>============</w:t>
       </w:r>
     </w:p>

</xml_diff>